<commit_message>
Letterhead: spell out Harvard Medical School, icon footer in burgundy; refresh docx
Co-Authored-By: Claude Sonnet 4.6 <noreply@anthropic.com>
</commit_message>
<xml_diff>
--- a/letterhead.docx
+++ b/letterhead.docx
@@ -4,236 +4,239 @@
   <w:body>
     <w:p>
       <w:pPr>
-        <w:spacing w:before="0" w:after="0"/>
+        <w:shd w:val="clear" w:color="auto" w:fill="f9f5f2"/>
+        <w:pBdr>
+          <w:top w:val="single" w:sz="40" w:space="0" w:color="670d00"/>
+        </w:pBdr>
+        <w:ind w:left="1440" w:right="1440"/>
+        <w:spacing w:before="220" w:after="0"/>
       </w:pPr>
     </w:p>
+    <w:p>
+      <w:pPr>
+        <w:shd w:val="clear" w:color="auto" w:fill="f9f5f2"/>
+        <w:ind w:left="1440" w:right="1440"/>
+        <w:spacing w:before="0" w:after="40"/>
+      </w:pPr>
+      <w:r>
+        <w:rPr>
+          <w:rFonts w:ascii="Georgia" w:hAnsi="Georgia"/>
+          <w:b/>
+          <w:color w:val="3D0800"/>
+          <w:sz w:val="36"/>
+        </w:rPr>
+        <w:t>David Dayan-Rosenman, MD</w:t>
+      </w:r>
+    </w:p>
+    <w:p>
+      <w:pPr>
+        <w:shd w:val="clear" w:color="auto" w:fill="f9f5f2"/>
+        <w:ind w:left="1440" w:right="1440"/>
+        <w:spacing w:before="0" w:after="20"/>
+      </w:pPr>
+      <w:r>
+        <w:rPr>
+          <w:rFonts w:ascii="Georgia" w:hAnsi="Georgia"/>
+          <w:i/>
+          <w:color w:val="670D00"/>
+          <w:sz w:val="20"/>
+        </w:rPr>
+        <w:t>Board Certified in Addiction Medicine &amp; Internal Medicine</w:t>
+      </w:r>
+    </w:p>
+    <w:p>
+      <w:pPr>
+        <w:shd w:val="clear" w:color="auto" w:fill="f9f5f2"/>
+        <w:ind w:left="1440" w:right="1440"/>
+        <w:spacing w:before="0" w:after="60"/>
+      </w:pPr>
+      <w:r>
+        <w:rPr>
+          <w:rFonts w:ascii="Georgia" w:hAnsi="Georgia"/>
+          <w:i/>
+          <w:color w:val="670D00"/>
+          <w:sz w:val="20"/>
+        </w:rPr>
+        <w:t>Instructor in Psychiatry, Harvard Medical School</w:t>
+      </w:r>
+    </w:p>
+    <w:p>
+      <w:pPr>
+        <w:shd w:val="clear" w:color="auto" w:fill="f9f5f2"/>
+        <w:ind w:left="1440" w:right="1440"/>
+        <w:spacing w:before="0" w:after="160"/>
+        <w:pBdr>
+          <w:bottom w:val="single" w:sz="6" w:space="4" w:color="670d00"/>
+        </w:pBdr>
+      </w:pPr>
+      <w:r>
+        <w:rPr>
+          <w:rFonts w:ascii="Calibri" w:hAnsi="Calibri"/>
+          <w:b/>
+          <w:color w:val="8A7A72"/>
+          <w:sz w:val="16"/>
+        </w:rPr>
+        <w:t>Mental Health &amp; Addiction Care  ·  Cambridge, MA</w:t>
+      </w:r>
+    </w:p>
+    <w:p>
+      <w:pPr>
+        <w:ind w:left="1440" w:right="1440"/>
+        <w:spacing w:before="0" w:after="0" w:line="240" w:lineRule="exact"/>
+      </w:pPr>
+    </w:p>
+    <w:p>
+      <w:pPr>
+        <w:ind w:left="1440" w:right="1440"/>
+        <w:spacing w:before="0" w:after="0" w:line="240" w:lineRule="exact"/>
+      </w:pPr>
+    </w:p>
+    <w:p>
+      <w:pPr>
+        <w:ind w:left="1440" w:right="1440"/>
+        <w:spacing w:before="0" w:after="0" w:line="240" w:lineRule="exact"/>
+      </w:pPr>
+    </w:p>
+    <w:p>
+      <w:pPr>
+        <w:ind w:left="1440" w:right="1440"/>
+        <w:spacing w:before="0" w:after="0" w:line="240" w:lineRule="exact"/>
+      </w:pPr>
+    </w:p>
+    <w:p>
+      <w:pPr>
+        <w:ind w:left="1440" w:right="1440"/>
+        <w:spacing w:before="0" w:after="0" w:line="240" w:lineRule="exact"/>
+      </w:pPr>
+    </w:p>
+    <w:p>
+      <w:pPr>
+        <w:ind w:left="1440" w:right="1440"/>
+        <w:spacing w:before="0" w:after="0" w:line="240" w:lineRule="exact"/>
+      </w:pPr>
+    </w:p>
+    <w:p>
+      <w:pPr>
+        <w:ind w:left="1440" w:right="1440"/>
+        <w:spacing w:before="0" w:after="0" w:line="240" w:lineRule="exact"/>
+      </w:pPr>
+    </w:p>
+    <w:p>
+      <w:pPr>
+        <w:ind w:left="1440" w:right="1440"/>
+        <w:spacing w:before="0" w:after="0" w:line="240" w:lineRule="exact"/>
+      </w:pPr>
+    </w:p>
+    <w:p>
+      <w:pPr>
+        <w:ind w:left="1440" w:right="1440"/>
+        <w:spacing w:before="0" w:after="0" w:line="240" w:lineRule="exact"/>
+      </w:pPr>
+    </w:p>
+    <w:p>
+      <w:pPr>
+        <w:ind w:left="1440" w:right="1440"/>
+        <w:spacing w:before="0" w:after="0" w:line="240" w:lineRule="exact"/>
+      </w:pPr>
+    </w:p>
+    <w:p>
+      <w:pPr>
+        <w:ind w:left="1440" w:right="1440"/>
+        <w:spacing w:before="0" w:after="0" w:line="240" w:lineRule="exact"/>
+      </w:pPr>
+    </w:p>
+    <w:p>
+      <w:pPr>
+        <w:ind w:left="1440" w:right="1440"/>
+        <w:spacing w:before="0" w:after="0" w:line="240" w:lineRule="exact"/>
+      </w:pPr>
+    </w:p>
+    <w:p>
+      <w:pPr>
+        <w:ind w:left="1440" w:right="1440"/>
+        <w:spacing w:before="0" w:after="0" w:line="240" w:lineRule="exact"/>
+      </w:pPr>
+    </w:p>
+    <w:p>
+      <w:pPr>
+        <w:ind w:left="1440" w:right="1440"/>
+        <w:spacing w:before="0" w:after="0" w:line="240" w:lineRule="exact"/>
+      </w:pPr>
+    </w:p>
+    <w:p>
+      <w:pPr>
+        <w:ind w:left="1440" w:right="1440"/>
+        <w:spacing w:before="0" w:after="0" w:line="240" w:lineRule="exact"/>
+      </w:pPr>
+    </w:p>
+    <w:p>
+      <w:pPr>
+        <w:ind w:left="1440" w:right="1440"/>
+        <w:spacing w:before="0" w:after="0" w:line="240" w:lineRule="exact"/>
+      </w:pPr>
+    </w:p>
+    <w:p>
+      <w:pPr>
+        <w:ind w:left="1440" w:right="1440"/>
+        <w:spacing w:before="0" w:after="0" w:line="240" w:lineRule="exact"/>
+      </w:pPr>
+    </w:p>
+    <w:p>
+      <w:pPr>
+        <w:ind w:left="1440" w:right="1440"/>
+        <w:spacing w:before="0" w:after="0" w:line="240" w:lineRule="exact"/>
+      </w:pPr>
+    </w:p>
+    <w:p>
+      <w:pPr>
+        <w:ind w:left="1440" w:right="1440"/>
+        <w:spacing w:before="0" w:after="0" w:line="240" w:lineRule="exact"/>
+      </w:pPr>
+    </w:p>
+    <w:p>
+      <w:pPr>
+        <w:ind w:left="1440" w:right="1440"/>
+        <w:spacing w:before="0" w:after="0" w:line="240" w:lineRule="exact"/>
+      </w:pPr>
+    </w:p>
+    <w:p>
+      <w:pPr>
+        <w:ind w:left="1440" w:right="1440"/>
+        <w:spacing w:before="0" w:after="0" w:line="240" w:lineRule="exact"/>
+      </w:pPr>
+    </w:p>
+    <w:p>
+      <w:pPr>
+        <w:ind w:left="1440" w:right="1440"/>
+        <w:spacing w:before="0" w:after="0" w:line="240" w:lineRule="exact"/>
+      </w:pPr>
+    </w:p>
+    <w:p>
+      <w:pPr>
+        <w:shd w:val="clear" w:color="auto" w:fill="f9f5f2"/>
+        <w:pBdr>
+          <w:top w:val="single" w:sz="6" w:space="4" w:color="670d00"/>
+        </w:pBdr>
+        <w:ind w:left="1440" w:right="1440"/>
+        <w:spacing w:before="80" w:after="80"/>
+      </w:pPr>
+      <w:r>
+        <w:rPr>
+          <w:rFonts w:ascii="Calibri" w:hAnsi="Calibri"/>
+          <w:color w:val="670D00"/>
+          <w:sz w:val="16"/>
+        </w:rPr>
+        <w:t>☎  (617) 528-0538    ✉  david@dayan-rosenman.net    ◎  1 Arnold Circle, Cambridge, MA 02139    ⊙  www.dayan-rosenman.net</w:t>
+      </w:r>
+    </w:p>
     <w:sectPr>
-      <w:headerReference w:type="default" r:id="rId9"/>
-      <w:footerReference w:type="default" r:id="rId10"/>
       <w:pgSz w:w="12240" w:h="15840"/>
-      <w:pgMar w:top="720" w:right="1440" w:bottom="1080" w:left="1440" w:header="432" w:footer="432" w:gutter="0"/>
+      <w:pgMar w:top="0" w:right="0" w:bottom="0" w:left="0" w:header="720" w:footer="720" w:gutter="0"/>
       <w:cols w:space="720"/>
       <w:docGrid w:linePitch="360"/>
-      <w:pgBorders w:offsetFrom="page">
-        <w:top w:val="single" w:sz="24" w:space="24" w:color="670D00"/>
-      </w:pgBorders>
     </w:sectPr>
   </w:body>
 </w:document>
-</file>
-
-<file path=word/footer1.xml><?xml version="1.0" encoding="utf-8"?>
-<w:ftr xmlns:m="http://schemas.openxmlformats.org/officeDocument/2006/math" xmlns:mc="http://schemas.openxmlformats.org/markup-compatibility/2006" xmlns:mo="http://schemas.microsoft.com/office/mac/office/2008/main" xmlns:mv="urn:schemas-microsoft-com:mac:vml" xmlns:o="urn:schemas-microsoft-com:office:office" xmlns:r="http://schemas.openxmlformats.org/officeDocument/2006/relationships" xmlns:v="urn:schemas-microsoft-com:vml" xmlns:w10="urn:schemas-microsoft-com:office:word" xmlns:w14="http://schemas.microsoft.com/office/word/2010/wordml" xmlns:w="http://schemas.openxmlformats.org/wordprocessingml/2006/main" xmlns:wne="http://schemas.microsoft.com/office/word/2006/wordml" xmlns:wp14="http://schemas.microsoft.com/office/word/2010/wordprocessingDrawing" xmlns:wp="http://schemas.openxmlformats.org/drawingml/2006/wordprocessingDrawing" xmlns:wpc="http://schemas.microsoft.com/office/word/2010/wordprocessingCanvas" xmlns:wpg="http://schemas.microsoft.com/office/word/2010/wordprocessingGroup" xmlns:wpi="http://schemas.microsoft.com/office/word/2010/wordprocessingInk" xmlns:wps="http://schemas.microsoft.com/office/word/2010/wordprocessingShape" mc:Ignorable="w14 wp14">
-  <w:p>
-    <w:pPr>
-      <w:pStyle w:val="Footer"/>
-      <w:jc w:val="center"/>
-      <w:spacing w:before="0" w:after="0"/>
-    </w:pPr>
-    <w:r>
-      <w:rPr>
-        <w:rFonts w:ascii="Calibri" w:hAnsi="Calibri"/>
-        <w:b w:val="0"/>
-        <w:i w:val="0"/>
-        <w:color w:val="8A7A72"/>
-        <w:sz w:val="16"/>
-      </w:rPr>
-      <w:t>David Dayan-Rosenman, MD  ·  1 Arnold Circle, Cambridge, MA 02139  ·  (617) 528-0538  ·  dayan-rosenman.net</w:t>
-    </w:r>
-  </w:p>
-</w:ftr>
-</file>
-
-<file path=word/header1.xml><?xml version="1.0" encoding="utf-8"?>
-<w:hdr xmlns:m="http://schemas.openxmlformats.org/officeDocument/2006/math" xmlns:mc="http://schemas.openxmlformats.org/markup-compatibility/2006" xmlns:mo="http://schemas.microsoft.com/office/mac/office/2008/main" xmlns:mv="urn:schemas-microsoft-com:mac:vml" xmlns:o="urn:schemas-microsoft-com:office:office" xmlns:r="http://schemas.openxmlformats.org/officeDocument/2006/relationships" xmlns:v="urn:schemas-microsoft-com:vml" xmlns:w10="urn:schemas-microsoft-com:office:word" xmlns:w14="http://schemas.microsoft.com/office/word/2010/wordml" xmlns:w="http://schemas.openxmlformats.org/wordprocessingml/2006/main" xmlns:wne="http://schemas.microsoft.com/office/word/2006/wordml" xmlns:wp14="http://schemas.microsoft.com/office/word/2010/wordprocessingDrawing" xmlns:wp="http://schemas.openxmlformats.org/drawingml/2006/wordprocessingDrawing" xmlns:wpc="http://schemas.microsoft.com/office/word/2010/wordprocessingCanvas" xmlns:wpg="http://schemas.microsoft.com/office/word/2010/wordprocessingGroup" xmlns:wpi="http://schemas.microsoft.com/office/word/2010/wordprocessingInk" xmlns:wps="http://schemas.microsoft.com/office/word/2010/wordprocessingShape" mc:Ignorable="w14 wp14">
-  <w:p>
-    <w:pPr>
-      <w:pStyle w:val="Header"/>
-      <w:jc w:val="left"/>
-      <w:spacing w:before="80" w:after="40"/>
-    </w:pPr>
-    <w:r>
-      <w:rPr>
-        <w:rFonts w:ascii="Georgia" w:hAnsi="Georgia"/>
-        <w:b/>
-        <w:i w:val="0"/>
-        <w:color w:val="3D0800"/>
-        <w:sz w:val="40"/>
-      </w:rPr>
-      <w:t>David Dayan-Rosenman, MD</w:t>
-    </w:r>
-  </w:p>
-  <w:p>
-    <w:pPr>
-      <w:spacing w:before="0" w:after="20"/>
-    </w:pPr>
-    <w:r>
-      <w:rPr>
-        <w:rFonts w:ascii="Calibri" w:hAnsi="Calibri"/>
-        <w:b w:val="0"/>
-        <w:i w:val="0"/>
-        <w:color w:val="8A7A72"/>
-        <w:sz w:val="20"/>
-      </w:rPr>
-      <w:t>Board Certified in Addiction Medicine &amp; Internal Medicine</w:t>
-    </w:r>
-  </w:p>
-  <w:p>
-    <w:pPr>
-      <w:spacing w:before="0" w:after="60"/>
-    </w:pPr>
-    <w:r>
-      <w:rPr>
-        <w:rFonts w:ascii="Calibri" w:hAnsi="Calibri"/>
-        <w:b w:val="0"/>
-        <w:i w:val="0"/>
-        <w:color w:val="8A7A72"/>
-        <w:sz w:val="20"/>
-      </w:rPr>
-      <w:t>Harvard Medical School Faculty</w:t>
-    </w:r>
-  </w:p>
-  <w:p>
-    <w:pPr>
-      <w:jc w:val="left"/>
-      <w:spacing w:before="0" w:after="80"/>
-      <w:pBdr>
-        <w:bottom w:val="single" w:sz="8" w:space="4" w:color="670D00"/>
-      </w:pBdr>
-    </w:pPr>
-    <w:r>
-      <w:rPr>
-        <w:rFonts w:ascii="Calibri" w:hAnsi="Calibri"/>
-        <w:b w:val="0"/>
-        <w:i w:val="0"/>
-        <w:caps/>
-        <w:color w:val="8A7A72"/>
-        <w:sz w:val="18"/>
-      </w:rPr>
-      <w:t>MENTAL HEALTH &amp; ADDICTION CARE  ·  CAMBRIDGE, MA</w:t>
-    </w:r>
-  </w:p>
-  <w:p>
-    <w:pPr>
-      <w:jc w:val="left"/>
-      <w:spacing w:before="60" w:after="0"/>
-    </w:pPr>
-    <w:r>
-      <w:rPr>
-        <w:rFonts w:ascii="Calibri" w:hAnsi="Calibri"/>
-        <w:b w:val="0"/>
-        <w:i w:val="0"/>
-        <w:caps/>
-        <w:color w:val="8A7A72"/>
-        <w:sz w:val="17"/>
-      </w:rPr>
-      <w:t xml:space="preserve">PHONE  </w:t>
-    </w:r>
-    <w:r>
-      <w:rPr>
-        <w:rFonts w:ascii="Calibri" w:hAnsi="Calibri"/>
-        <w:b w:val="0"/>
-        <w:i w:val="0"/>
-        <w:color w:val="3A3230"/>
-        <w:sz w:val="19"/>
-      </w:rPr>
-      <w:t>(617) 528-0538</w:t>
-    </w:r>
-    <w:r>
-      <w:rPr>
-        <w:rFonts w:ascii="Calibri" w:hAnsi="Calibri"/>
-        <w:b w:val="0"/>
-        <w:i w:val="0"/>
-        <w:color w:val="8A7A72"/>
-        <w:sz w:val="19"/>
-      </w:rPr>
-      <w:t xml:space="preserve">    ·    </w:t>
-    </w:r>
-    <w:r>
-      <w:rPr>
-        <w:rFonts w:ascii="Calibri" w:hAnsi="Calibri"/>
-        <w:b w:val="0"/>
-        <w:i w:val="0"/>
-        <w:caps/>
-        <w:color w:val="8A7A72"/>
-        <w:sz w:val="17"/>
-      </w:rPr>
-      <w:t xml:space="preserve">EMAIL  </w:t>
-    </w:r>
-    <w:r>
-      <w:rPr>
-        <w:rFonts w:ascii="Calibri" w:hAnsi="Calibri"/>
-        <w:b w:val="0"/>
-        <w:i w:val="0"/>
-        <w:color w:val="3A3230"/>
-        <w:sz w:val="19"/>
-      </w:rPr>
-      <w:t>david@dayan-rosenman.net</w:t>
-    </w:r>
-    <w:r>
-      <w:rPr>
-        <w:rFonts w:ascii="Calibri" w:hAnsi="Calibri"/>
-        <w:b w:val="0"/>
-        <w:i w:val="0"/>
-        <w:color w:val="8A7A72"/>
-        <w:sz w:val="19"/>
-      </w:rPr>
-      <w:t xml:space="preserve">    ·    </w:t>
-    </w:r>
-    <w:r>
-      <w:rPr>
-        <w:rFonts w:ascii="Calibri" w:hAnsi="Calibri"/>
-        <w:b w:val="0"/>
-        <w:i w:val="0"/>
-        <w:caps/>
-        <w:color w:val="8A7A72"/>
-        <w:sz w:val="17"/>
-      </w:rPr>
-      <w:t xml:space="preserve">OFFICE  </w:t>
-    </w:r>
-    <w:r>
-      <w:rPr>
-        <w:rFonts w:ascii="Calibri" w:hAnsi="Calibri"/>
-        <w:b w:val="0"/>
-        <w:i w:val="0"/>
-        <w:color w:val="3A3230"/>
-        <w:sz w:val="19"/>
-      </w:rPr>
-      <w:t>1 Arnold Circle, Cambridge, MA 02139</w:t>
-    </w:r>
-    <w:r>
-      <w:rPr>
-        <w:rFonts w:ascii="Calibri" w:hAnsi="Calibri"/>
-        <w:b w:val="0"/>
-        <w:i w:val="0"/>
-        <w:color w:val="8A7A72"/>
-        <w:sz w:val="19"/>
-      </w:rPr>
-      <w:t xml:space="preserve">    ·    </w:t>
-    </w:r>
-    <w:r>
-      <w:rPr>
-        <w:rFonts w:ascii="Calibri" w:hAnsi="Calibri"/>
-        <w:b w:val="0"/>
-        <w:i w:val="0"/>
-        <w:caps/>
-        <w:color w:val="8A7A72"/>
-        <w:sz w:val="17"/>
-      </w:rPr>
-      <w:t xml:space="preserve">WEB  </w:t>
-    </w:r>
-    <w:r>
-      <w:rPr>
-        <w:rFonts w:ascii="Calibri" w:hAnsi="Calibri"/>
-        <w:b w:val="0"/>
-        <w:i w:val="0"/>
-        <w:color w:val="3A3230"/>
-        <w:sz w:val="19"/>
-      </w:rPr>
-      <w:t>dayan-rosenman.net</w:t>
-    </w:r>
-  </w:p>
-</w:hdr>
 </file>
 
 <file path=word/numbering.xml><?xml version="1.0" encoding="utf-8"?>

</xml_diff>